<commit_message>
SOP final review; record the exe decision; wrap-up
- SOP (user's final edits + review): developer material moved to the end
  as Appendix A (Python version) and Appendix B (releasing an updated GUI),
  so operators go straight from setup (4.1-4.3) to the checklist and
  session; cross-references updated. Clearer Python-version intro, a
  version line (v1.0, matches GUI v1.0.0), and "GUI program downloaded"
  added to the pre-session checklist.
- DESIGN_DECISIONS: 7.6 Windows executable released on version tags;
  timeline rows for the handover docs and release v1.0.0.
- HANDOVER: current state mentions the released exe and the final SOP;
  release steps point to SOP Appendix B.

Co-Authored-By: Claude Opus 5.5 <noreply@anthropic.com>
Claude-Session: https://claude.ai/code/session_0168zQykpFCiWMnuLtZC4oyp
</commit_message>
<xml_diff>
--- a/docs/Design_Decisions.docx
+++ b/docs/Design_Decisions.docx
@@ -4732,7 +4732,7 @@
     </w:tbl>
     <w:bookmarkEnd w:id="47"/>
     <w:bookmarkEnd w:id="48"/>
-    <w:bookmarkStart w:id="54" w:name="pc-software"/>
+    <w:bookmarkStart w:id="55" w:name="pc-software"/>
     <w:p>
       <w:pPr>
         <w:pStyle w:val="Heading1"/>
@@ -5277,8 +5277,279 @@
       </w:r>
     </w:p>
     <w:bookmarkEnd w:id="53"/>
+    <w:bookmarkStart w:id="54" w:name="Xaa329d417512866ba0f3049d83699d9155adb3c"/>
+    <w:p>
+      <w:pPr>
+        <w:pStyle w:val="Heading2"/>
+      </w:pPr>
+      <w:r>
+        <w:t xml:space="preserve">7.6 Windows executable, released on version tags</w:t>
+      </w:r>
+    </w:p>
+    <w:p>
+      <w:pPr>
+        <w:numPr>
+          <w:ilvl w:val="0"/>
+          <w:numId w:val="1027"/>
+        </w:numPr>
+        <w:pStyle w:val="Compact"/>
+      </w:pPr>
+      <w:r>
+        <w:rPr>
+          <w:bCs/>
+          <w:b/>
+        </w:rPr>
+        <w:t xml:space="preserve">Decision:</w:t>
+      </w:r>
+      <w:r>
+        <w:t xml:space="preserve"> </w:t>
+      </w:r>
+      <w:r>
+        <w:t xml:space="preserve">Ship the GUI to operators as a single Windows program,</w:t>
+      </w:r>
+      <w:r>
+        <w:t xml:space="preserve"> </w:t>
+      </w:r>
+      <w:r>
+        <w:rPr>
+          <w:rStyle w:val="VerbatimChar"/>
+        </w:rPr>
+        <w:t xml:space="preserve">KneeGoniometerGUI.exe</w:t>
+      </w:r>
+      <w:r>
+        <w:t xml:space="preserve">, built with PyInstaller (one file, windowed) by a</w:t>
+      </w:r>
+      <w:r>
+        <w:t xml:space="preserve"> </w:t>
+      </w:r>
+      <w:r>
+        <w:t xml:space="preserve">GitHub Actions workflow. Pushing a</w:t>
+      </w:r>
+      <w:r>
+        <w:t xml:space="preserve"> </w:t>
+      </w:r>
+      <w:r>
+        <w:rPr>
+          <w:rStyle w:val="VerbatimChar"/>
+        </w:rPr>
+        <w:t xml:space="preserve">v*</w:t>
+      </w:r>
+      <w:r>
+        <w:t xml:space="preserve"> </w:t>
+      </w:r>
+      <w:r>
+        <w:t xml:space="preserve">tag runs the self-test, builds the exe</w:t>
+      </w:r>
+      <w:r>
+        <w:t xml:space="preserve"> </w:t>
+      </w:r>
+      <w:r>
+        <w:t xml:space="preserve">and publishes it on the Releases page.</w:t>
+      </w:r>
+    </w:p>
+    <w:p>
+      <w:pPr>
+        <w:numPr>
+          <w:ilvl w:val="0"/>
+          <w:numId w:val="1027"/>
+        </w:numPr>
+        <w:pStyle w:val="Compact"/>
+      </w:pPr>
+      <w:r>
+        <w:rPr>
+          <w:bCs/>
+          <w:b/>
+        </w:rPr>
+        <w:t xml:space="preserve">Why:</w:t>
+      </w:r>
+      <w:r>
+        <w:t xml:space="preserve"> </w:t>
+      </w:r>
+      <w:r>
+        <w:t xml:space="preserve">People collecting data should not need to install Python or use a</w:t>
+      </w:r>
+      <w:r>
+        <w:t xml:space="preserve"> </w:t>
+      </w:r>
+      <w:r>
+        <w:t xml:space="preserve">terminal. Building in CI from a tag ties each exe to a known commit and keeps</w:t>
+      </w:r>
+      <w:r>
+        <w:t xml:space="preserve"> </w:t>
+      </w:r>
+      <w:r>
+        <w:t xml:space="preserve">the build repeatable; the self-test step stops a broken GUI from being released.</w:t>
+      </w:r>
+    </w:p>
+    <w:p>
+      <w:pPr>
+        <w:numPr>
+          <w:ilvl w:val="0"/>
+          <w:numId w:val="1027"/>
+        </w:numPr>
+        <w:pStyle w:val="Compact"/>
+      </w:pPr>
+      <w:r>
+        <w:rPr>
+          <w:bCs/>
+          <w:b/>
+        </w:rPr>
+        <w:t xml:space="preserve">Alternatives:</w:t>
+      </w:r>
+      <w:r>
+        <w:t xml:space="preserve"> </w:t>
+      </w:r>
+      <w:r>
+        <w:t xml:space="preserve">Running from source for everyone (too much setup for</w:t>
+      </w:r>
+      <w:r>
+        <w:t xml:space="preserve"> </w:t>
+      </w:r>
+      <w:r>
+        <w:t xml:space="preserve">operators); building the exe by hand on a developer’s PC (not repeatable, easy</w:t>
+      </w:r>
+      <w:r>
+        <w:t xml:space="preserve"> </w:t>
+      </w:r>
+      <w:r>
+        <w:t xml:space="preserve">to ship uncommitted changes).</w:t>
+      </w:r>
+    </w:p>
+    <w:p>
+      <w:pPr>
+        <w:numPr>
+          <w:ilvl w:val="0"/>
+          <w:numId w:val="1027"/>
+        </w:numPr>
+        <w:pStyle w:val="Compact"/>
+      </w:pPr>
+      <w:r>
+        <w:rPr>
+          <w:bCs/>
+          <w:b/>
+        </w:rPr>
+        <w:t xml:space="preserve">Trade-offs:</w:t>
+      </w:r>
+      <w:r>
+        <w:t xml:space="preserve"> </w:t>
+      </w:r>
+      <w:r>
+        <w:t xml:space="preserve">Windows only (macOS/Linux use the Python version); the exe is</w:t>
+      </w:r>
+      <w:r>
+        <w:t xml:space="preserve"> </w:t>
+      </w:r>
+      <w:r>
+        <w:t xml:space="preserve">unsigned, so Windows SmartScreen warns on first run; recordings are saved next</w:t>
+      </w:r>
+      <w:r>
+        <w:t xml:space="preserve"> </w:t>
+      </w:r>
+      <w:r>
+        <w:t xml:space="preserve">to the exe, so it must live in a writable folder.</w:t>
+      </w:r>
+    </w:p>
+    <w:p>
+      <w:pPr>
+        <w:numPr>
+          <w:ilvl w:val="0"/>
+          <w:numId w:val="1027"/>
+        </w:numPr>
+        <w:pStyle w:val="Compact"/>
+      </w:pPr>
+      <w:r>
+        <w:rPr>
+          <w:bCs/>
+          <w:b/>
+        </w:rPr>
+        <w:t xml:space="preserve">Evidence:</w:t>
+      </w:r>
+      <w:r>
+        <w:t xml:space="preserve"> </w:t>
+      </w:r>
+      <w:r>
+        <w:rPr>
+          <w:rStyle w:val="VerbatimChar"/>
+        </w:rPr>
+        <w:t xml:space="preserve">572b164</w:t>
+      </w:r>
+      <w:r>
+        <w:t xml:space="preserve"> </w:t>
+      </w:r>
+      <w:r>
+        <w:t xml:space="preserve">(</w:t>
+      </w:r>
+      <w:r>
+        <w:rPr>
+          <w:rStyle w:val="VerbatimChar"/>
+        </w:rPr>
+        <w:t xml:space="preserve">.github/workflows/release.yml</w:t>
+      </w:r>
+      <w:r>
+        <w:t xml:space="preserve">); release</w:t>
+      </w:r>
+      <w:r>
+        <w:t xml:space="preserve"> </w:t>
+      </w:r>
+      <w:r>
+        <w:rPr>
+          <w:rStyle w:val="VerbatimChar"/>
+        </w:rPr>
+        <w:t xml:space="preserve">v1.0.0</w:t>
+      </w:r>
+      <w:r>
+        <w:t xml:space="preserve">.</w:t>
+      </w:r>
+    </w:p>
+    <w:p>
+      <w:pPr>
+        <w:numPr>
+          <w:ilvl w:val="0"/>
+          <w:numId w:val="1027"/>
+        </w:numPr>
+        <w:pStyle w:val="Compact"/>
+      </w:pPr>
+      <w:r>
+        <w:rPr>
+          <w:bCs/>
+          <w:b/>
+        </w:rPr>
+        <w:t xml:space="preserve">Status:</w:t>
+      </w:r>
+      <w:r>
+        <w:t xml:space="preserve"> </w:t>
+      </w:r>
+      <w:r>
+        <w:t xml:space="preserve">In use. How to publish a new version: README,</w:t>
+      </w:r>
+      <w:r>
+        <w:t xml:space="preserve"> </w:t>
+      </w:r>
+      <w:r>
+        <w:t xml:space="preserve">“</w:t>
+      </w:r>
+      <w:r>
+        <w:t xml:space="preserve">Releasing an</w:t>
+      </w:r>
+      <w:r>
+        <w:t xml:space="preserve"> </w:t>
+      </w:r>
+      <w:r>
+        <w:t xml:space="preserve">updated GUI</w:t>
+      </w:r>
+      <w:r>
+        <w:t xml:space="preserve">”</w:t>
+      </w:r>
+      <w:r>
+        <w:t xml:space="preserve"> </w:t>
+      </w:r>
+      <w:r>
+        <w:t xml:space="preserve">(also SOP Appendix B).</w:t>
+      </w:r>
+    </w:p>
     <w:bookmarkEnd w:id="54"/>
-    <w:bookmarkStart w:id="58" w:name="testing-and-validation"/>
+    <w:bookmarkEnd w:id="55"/>
+    <w:bookmarkStart w:id="59" w:name="testing-and-validation"/>
     <w:p>
       <w:pPr>
         <w:pStyle w:val="Heading1"/>
@@ -5287,7 +5558,7 @@
         <w:t xml:space="preserve">8. Testing and validation</w:t>
       </w:r>
     </w:p>
-    <w:bookmarkStart w:id="55" w:name="preliminary-stationary-testing-sept-2026"/>
+    <w:bookmarkStart w:id="56" w:name="preliminary-stationary-testing-sept-2026"/>
     <w:p>
       <w:pPr>
         <w:pStyle w:val="Heading2"/>
@@ -5569,7 +5840,7 @@
       <w:pPr>
         <w:numPr>
           <w:ilvl w:val="0"/>
-          <w:numId w:val="1027"/>
+          <w:numId w:val="1028"/>
         </w:numPr>
         <w:pStyle w:val="Compact"/>
       </w:pPr>
@@ -5597,7 +5868,7 @@
       <w:pPr>
         <w:numPr>
           <w:ilvl w:val="0"/>
-          <w:numId w:val="1027"/>
+          <w:numId w:val="1028"/>
         </w:numPr>
         <w:pStyle w:val="Compact"/>
       </w:pPr>
@@ -5625,7 +5896,7 @@
       <w:pPr>
         <w:numPr>
           <w:ilvl w:val="0"/>
-          <w:numId w:val="1027"/>
+          <w:numId w:val="1028"/>
         </w:numPr>
         <w:pStyle w:val="Compact"/>
       </w:pPr>
@@ -5649,8 +5920,8 @@
         <w:t xml:space="preserve">showed that Session 2’s creep was the rig settling, not sensor drift.</w:t>
       </w:r>
     </w:p>
-    <w:bookmarkEnd w:id="55"/>
-    <w:bookmarkStart w:id="56" w:name="earlier-bench-checks"/>
+    <w:bookmarkEnd w:id="56"/>
+    <w:bookmarkStart w:id="57" w:name="earlier-bench-checks"/>
     <w:p>
       <w:pPr>
         <w:pStyle w:val="Heading2"/>
@@ -5706,8 +5977,8 @@
         <w:t xml:space="preserve">.</w:t>
       </w:r>
     </w:p>
-    <w:bookmarkEnd w:id="56"/>
-    <w:bookmarkStart w:id="57" w:name="not-yet-tested"/>
+    <w:bookmarkEnd w:id="57"/>
+    <w:bookmarkStart w:id="58" w:name="not-yet-tested"/>
     <w:p>
       <w:pPr>
         <w:pStyle w:val="Heading2"/>
@@ -5730,9 +6001,9 @@
         <w:t xml:space="preserve">against a goniometer or precise rig; noise below the 0.01° log resolution.</w:t>
       </w:r>
     </w:p>
-    <w:bookmarkEnd w:id="57"/>
     <w:bookmarkEnd w:id="58"/>
-    <w:bookmarkStart w:id="59" w:name="directions-considered-but-not-pursued"/>
+    <w:bookmarkEnd w:id="59"/>
+    <w:bookmarkStart w:id="60" w:name="directions-considered-but-not-pursued"/>
     <w:p>
       <w:pPr>
         <w:pStyle w:val="Heading1"/>
@@ -5950,8 +6221,8 @@
         </w:tc>
       </w:tr>
     </w:tbl>
-    <w:bookmarkEnd w:id="59"/>
-    <w:bookmarkStart w:id="60" w:name="timeline-of-major-milestones"/>
+    <w:bookmarkEnd w:id="60"/>
+    <w:bookmarkStart w:id="61" w:name="timeline-of-major-milestones"/>
     <w:p>
       <w:pPr>
         <w:pStyle w:val="Heading1"/>
@@ -6651,8 +6922,103 @@
           </w:p>
         </w:tc>
       </w:tr>
+      <w:tr>
+        <w:tc>
+          <w:tcPr/>
+          <w:p>
+            <w:pPr>
+              <w:pStyle w:val="Compact"/>
+              <w:jc w:val="left"/>
+            </w:pPr>
+            <w:r>
+              <w:rPr>
+                <w:sz w:val="19"/>
+              </w:rPr>
+              <w:t xml:space="preserve">Oct 9–13</w:t>
+            </w:r>
+          </w:p>
+        </w:tc>
+        <w:tc>
+          <w:tcPr/>
+          <w:p>
+            <w:pPr>
+              <w:pStyle w:val="Compact"/>
+              <w:jc w:val="left"/>
+            </w:pPr>
+            <w:r>
+              <w:rPr>
+                <w:sz w:val="19"/>
+              </w:rPr>
+              <w:t xml:space="preserve">Handover docs: SOP, design decisions, handover summary</w:t>
+            </w:r>
+          </w:p>
+        </w:tc>
+        <w:tc>
+          <w:tcPr/>
+          <w:p>
+            <w:pPr>
+              <w:pStyle w:val="Compact"/>
+              <w:jc w:val="left"/>
+            </w:pPr>
+            <w:r>
+              <w:rPr>
+                <w:sz w:val="19"/>
+              </w:rPr>
+              <w:t xml:space="preserve">this branch</w:t>
+            </w:r>
+          </w:p>
+        </w:tc>
+      </w:tr>
+      <w:tr>
+        <w:tc>
+          <w:tcPr/>
+          <w:p>
+            <w:pPr>
+              <w:pStyle w:val="Compact"/>
+              <w:jc w:val="left"/>
+            </w:pPr>
+            <w:r>
+              <w:rPr>
+                <w:sz w:val="19"/>
+              </w:rPr>
+              <w:t xml:space="preserve">Oct 13</w:t>
+            </w:r>
+          </w:p>
+        </w:tc>
+        <w:tc>
+          <w:tcPr/>
+          <w:p>
+            <w:pPr>
+              <w:pStyle w:val="Compact"/>
+              <w:jc w:val="left"/>
+            </w:pPr>
+            <w:r>
+              <w:rPr>
+                <w:sz w:val="19"/>
+              </w:rPr>
+              <w:t xml:space="preserve">Windows exe build workflow; release v1.0.0</w:t>
+            </w:r>
+          </w:p>
+        </w:tc>
+        <w:tc>
+          <w:tcPr/>
+          <w:p>
+            <w:pPr>
+              <w:pStyle w:val="Compact"/>
+              <w:jc w:val="left"/>
+            </w:pPr>
+            <w:r>
+              <w:rPr>
+                <w:rStyle w:val="VerbatimChar"/>
+                <w:sz w:val="19"/>
+              </w:rPr>
+              <w:t xml:space="preserve">572b164</w:t>
+            </w:r>
+          </w:p>
+        </w:tc>
+      </w:tr>
     </w:tbl>
-    <w:bookmarkEnd w:id="60"/>
+    <w:bookmarkEnd w:id="61"/>
     <w:sectPr>
       <w:pgSz w:h="15840" w:w="12240"/>
       <w:pgMar w:bottom="1080" w:left="1080" w:right="1080" w:top="1080"/>
@@ -7032,6 +7398,9 @@
     <w:abstractNumId w:val="991"/>
   </w:num>
   <w:num w:numId="1027">
+    <w:abstractNumId w:val="991"/>
+  </w:num>
+  <w:num w:numId="1028">
     <w:abstractNumId w:val="991"/>
   </w:num>
 </w:numbering>

</xml_diff>